<commit_message>
docs update US-03 registration test results
</commit_message>
<xml_diff>
--- a/Test-Plan-Personal-Finance-Expense-Manager.docx
+++ b/Test-Plan-Personal-Finance-Expense-Manager.docx
@@ -600,13 +600,21 @@
           <w:tcPr>
             <w:tcW w:w="1440" w:type="dxa"/>
           </w:tcPr>
-          <w:p/>
+          <w:p>
+            <w:r>
+              <w:t>Registration with a valid mobile number was accepted, and email verification succeeded.</w:t>
+            </w:r>
+          </w:p>
         </w:tc>
         <w:tc>
           <w:tcPr>
             <w:tcW w:w="1080" w:type="dxa"/>
           </w:tcPr>
-          <w:p/>
+          <w:p>
+            <w:r>
+              <w:t>Passed</w:t>
+            </w:r>
+          </w:p>
         </w:tc>
       </w:tr>
       <w:tr>
@@ -1022,7 +1030,14 @@
               <w:rPr>
                 <w:sz w:val="14"/>
               </w:rPr>
-              <w:t>1. Enter wrong OTP three times. 2. Attempt a fourth verification. 3. Request resend three times within one hour. 4. Attempt another resend.</w:t>
+              <w:t xml:space="preserve">1. Enter wrong OTP three times. 2. Attempt a fourth </w:t>
+            </w:r>
+            <w:r>
+              <w:rPr>
+                <w:sz w:val="14"/>
+              </w:rPr>
+              <w:lastRenderedPageBreak/>
+              <w:t>verification. 3. Request resend three times within one hour. 4. Attempt another resend.</w:t>
             </w:r>
           </w:p>
         </w:tc>
@@ -1035,6 +1050,7 @@
               <w:rPr>
                 <w:sz w:val="14"/>
               </w:rPr>
+              <w:lastRenderedPageBreak/>
               <w:t>Wrong OTPs; resend requests within 1 hour</w:t>
             </w:r>
           </w:p>
@@ -1048,7 +1064,14 @@
               <w:rPr>
                 <w:sz w:val="14"/>
               </w:rPr>
-              <w:t>Verification does not allow more than three attempts, and resend requests are limited to three per hour.</w:t>
+              <w:t xml:space="preserve">Verification does not allow more than three attempts, and resend </w:t>
+            </w:r>
+            <w:r>
+              <w:rPr>
+                <w:sz w:val="14"/>
+              </w:rPr>
+              <w:lastRenderedPageBreak/>
+              <w:t>requests are limited to three per hour.</w:t>
             </w:r>
           </w:p>
         </w:tc>
@@ -1058,11 +1081,12 @@
           </w:tcPr>
           <w:p>
             <w:r>
-              <w:t xml:space="preserve">After three incorrect verification attempts, further </w:t>
-            </w:r>
-            <w:r>
               <w:lastRenderedPageBreak/>
-              <w:t>verification was blocked and a new code was required. Three resend requests were allowed within the hour; the next request was rejected with "Resend limit reached. Please try again later."</w:t>
+              <w:t xml:space="preserve">After three </w:t>
+            </w:r>
+            <w:r>
+              <w:lastRenderedPageBreak/>
+              <w:t>incorrect verification attempts, further verification was blocked and a new code was required. Three resend requests were allowed within the hour; the next request was rejected with "Resend limit reached. Please try again later."</w:t>
             </w:r>
           </w:p>
         </w:tc>
@@ -1855,6 +1879,7 @@
               <w:rPr>
                 <w:sz w:val="14"/>
               </w:rPr>
+              <w:lastRenderedPageBreak/>
               <w:t>UT_64</w:t>
             </w:r>
           </w:p>
@@ -1989,14 +2014,7 @@
               <w:rPr>
                 <w:sz w:val="14"/>
               </w:rPr>
-              <w:t xml:space="preserve">Verify Terms and Privacy consent is mandatory at </w:t>
-            </w:r>
-            <w:r>
-              <w:rPr>
-                <w:sz w:val="14"/>
-              </w:rPr>
-              <w:lastRenderedPageBreak/>
-              <w:t>registration (REQ-12)</w:t>
+              <w:t>Verify Terms and Privacy consent is mandatory at registration (REQ-12)</w:t>
             </w:r>
           </w:p>
         </w:tc>
@@ -2009,7 +2027,6 @@
               <w:rPr>
                 <w:sz w:val="14"/>
               </w:rPr>
-              <w:lastRenderedPageBreak/>
               <w:t>Registration form is open</w:t>
             </w:r>
           </w:p>
@@ -2023,14 +2040,7 @@
               <w:rPr>
                 <w:sz w:val="14"/>
               </w:rPr>
-              <w:t xml:space="preserve">1. Leave Terms/Privacy consent unchecked. 2. </w:t>
-            </w:r>
-            <w:r>
-              <w:rPr>
-                <w:sz w:val="14"/>
-              </w:rPr>
-              <w:lastRenderedPageBreak/>
-              <w:t>Submit. 3. Repeat with consent checked.</w:t>
+              <w:t>1. Leave Terms/Privacy consent unchecked. 2. Submit. 3. Repeat with consent checked.</w:t>
             </w:r>
           </w:p>
         </w:tc>
@@ -2043,7 +2053,6 @@
               <w:rPr>
                 <w:sz w:val="14"/>
               </w:rPr>
-              <w:lastRenderedPageBreak/>
               <w:t>Consent: No, then Yes</w:t>
             </w:r>
           </w:p>
@@ -2057,14 +2066,7 @@
               <w:rPr>
                 <w:sz w:val="14"/>
               </w:rPr>
-              <w:t xml:space="preserve">No account is created without explicit consent; with consent, </w:t>
-            </w:r>
-            <w:r>
-              <w:rPr>
-                <w:sz w:val="14"/>
-              </w:rPr>
-              <w:lastRenderedPageBreak/>
-              <w:t>registration proceeds and consent is recorded.</w:t>
+              <w:t>No account is created without explicit consent; with consent, registration proceeds and consent is recorded.</w:t>
             </w:r>
           </w:p>
         </w:tc>
@@ -2074,12 +2076,7 @@
           </w:tcPr>
           <w:p>
             <w:r>
-              <w:lastRenderedPageBreak/>
-              <w:t xml:space="preserve">Submission </w:t>
-            </w:r>
-            <w:r>
-              <w:lastRenderedPageBreak/>
-              <w:t>was blocked by browser validation when the Terms of Service checkbox was unchecked. No registration request was submitted.</w:t>
+              <w:t>Submission was blocked by browser validation when the Terms of Service checkbox was unchecked. No registration request was submitted.</w:t>
             </w:r>
           </w:p>
         </w:tc>
@@ -2089,7 +2086,6 @@
           </w:tcPr>
           <w:p>
             <w:r>
-              <w:lastRenderedPageBreak/>
               <w:t>Passed</w:t>
             </w:r>
           </w:p>
@@ -22662,6 +22658,7 @@
   <w:style w:type="character" w:default="1" w:styleId="DefaultParagraphFont">
     <w:name w:val="Default Paragraph Font"/>
     <w:uiPriority w:val="1"/>
+    <w:semiHidden/>
     <w:unhideWhenUsed/>
   </w:style>
   <w:style w:type="table" w:default="1" w:styleId="TableNormal">

</xml_diff>

<commit_message>
docs(test-plan): record US-04 authentication results
</commit_message>
<xml_diff>
--- a/Test-Plan-Personal-Finance-Expense-Manager.docx
+++ b/Test-Plan-Personal-Finance-Expense-Manager.docx
@@ -235,15 +235,15 @@
         <w:tblLook w:val="04A0" w:firstRow="1" w:lastRow="0" w:firstColumn="1" w:lastColumn="0" w:noHBand="0" w:noVBand="1"/>
       </w:tblPr>
       <w:tblGrid>
-        <w:gridCol w:w="1098"/>
-        <w:gridCol w:w="1452"/>
-        <w:gridCol w:w="1804"/>
-        <w:gridCol w:w="1742"/>
-        <w:gridCol w:w="2049"/>
-        <w:gridCol w:w="1602"/>
-        <w:gridCol w:w="2378"/>
-        <w:gridCol w:w="1438"/>
-        <w:gridCol w:w="1197"/>
+        <w:gridCol w:w="1096"/>
+        <w:gridCol w:w="1449"/>
+        <w:gridCol w:w="1798"/>
+        <w:gridCol w:w="1738"/>
+        <w:gridCol w:w="2042"/>
+        <w:gridCol w:w="1599"/>
+        <w:gridCol w:w="2373"/>
+        <w:gridCol w:w="1471"/>
+        <w:gridCol w:w="1194"/>
       </w:tblGrid>
       <w:tr>
         <w:trPr>
@@ -1058,11 +1058,11 @@
           </w:tcPr>
           <w:p>
             <w:r>
-              <w:t xml:space="preserve">After three incorrect verification attempts, further </w:t>
+              <w:t xml:space="preserve">After three incorrect verification attempts, further verification was </w:t>
             </w:r>
             <w:r>
               <w:lastRenderedPageBreak/>
-              <w:t>verification was blocked and a new code was required. Three resend requests were allowed within the hour; the next request was rejected with "Resend limit reached. Please try again later."</w:t>
+              <w:t>blocked and a new code was required. Three resend requests were allowed within the hour; the next request was rejected with "Resend limit reached. Please try again later."</w:t>
             </w:r>
           </w:p>
         </w:tc>
@@ -1177,12 +1177,21 @@
           <w:tcPr>
             <w:tcW w:w="1440" w:type="dxa"/>
           </w:tcPr>
-          <w:p/>
+          <w:p>
+            <w:r>
+              <w:t>Repeated failed sign-ins triggered a 15-minute lockout; correct password was rejected during the lock; notification email received</w:t>
+            </w:r>
+          </w:p>
         </w:tc>
         <w:tc>
           <w:tcPr>
             <w:tcW w:w="1080" w:type="dxa"/>
           </w:tcPr>
+          <w:p>
+            <w:r>
+              <w:t>Pass</w:t>
+            </w:r>
+          </w:p>
           <w:p/>
         </w:tc>
       </w:tr>
@@ -1285,13 +1294,21 @@
           <w:tcPr>
             <w:tcW w:w="1440" w:type="dxa"/>
           </w:tcPr>
-          <w:p/>
+          <w:p>
+            <w:r>
+              <w:t>Sign-in succeeded; code configures JWT expiry as 24 hours, but token expiry was not independently inspected</w:t>
+            </w:r>
+          </w:p>
         </w:tc>
         <w:tc>
           <w:tcPr>
             <w:tcW w:w="1080" w:type="dxa"/>
           </w:tcPr>
-          <w:p/>
+          <w:p>
+            <w:r>
+              <w:t>Partial</w:t>
+            </w:r>
+          </w:p>
         </w:tc>
       </w:tr>
       <w:tr>
@@ -1509,13 +1526,21 @@
           <w:tcPr>
             <w:tcW w:w="1440" w:type="dxa"/>
           </w:tcPr>
-          <w:p/>
+          <w:p>
+            <w:r>
+              <w:t>Password hash and work factor have not been independently verified in the database.</w:t>
+            </w:r>
+          </w:p>
         </w:tc>
         <w:tc>
           <w:tcPr>
             <w:tcW w:w="1080" w:type="dxa"/>
           </w:tcPr>
-          <w:p/>
+          <w:p>
+            <w:r>
+              <w:t>Not Run</w:t>
+            </w:r>
+          </w:p>
         </w:tc>
       </w:tr>
       <w:tr>
@@ -1544,7 +1569,14 @@
               <w:rPr>
                 <w:sz w:val="14"/>
               </w:rPr>
-              <w:t>User Registration &amp; Authentication</w:t>
+              <w:t xml:space="preserve">User Registration &amp; </w:t>
+            </w:r>
+            <w:r>
+              <w:rPr>
+                <w:sz w:val="14"/>
+              </w:rPr>
+              <w:lastRenderedPageBreak/>
+              <w:t>Authentication</w:t>
             </w:r>
           </w:p>
         </w:tc>
@@ -1557,7 +1589,15 @@
               <w:rPr>
                 <w:sz w:val="14"/>
               </w:rPr>
-              <w:t>Verify password reset link is single-use and expires after 15 minutes (REQ-9)</w:t>
+              <w:lastRenderedPageBreak/>
+              <w:t xml:space="preserve">Verify password reset link </w:t>
+            </w:r>
+            <w:r>
+              <w:rPr>
+                <w:sz w:val="14"/>
+              </w:rPr>
+              <w:lastRenderedPageBreak/>
+              <w:t>is single-use and expires after 15 minutes (REQ-9)</w:t>
             </w:r>
           </w:p>
         </w:tc>
@@ -1570,7 +1610,15 @@
               <w:rPr>
                 <w:sz w:val="14"/>
               </w:rPr>
-              <w:t>Verified user can request password reset</w:t>
+              <w:lastRenderedPageBreak/>
+              <w:t xml:space="preserve">Verified user can request </w:t>
+            </w:r>
+            <w:r>
+              <w:rPr>
+                <w:sz w:val="14"/>
+              </w:rPr>
+              <w:lastRenderedPageBreak/>
+              <w:t>password reset</w:t>
             </w:r>
           </w:p>
         </w:tc>
@@ -1583,7 +1631,15 @@
               <w:rPr>
                 <w:sz w:val="14"/>
               </w:rPr>
-              <w:t>1. Request reset. 2. Use link within 15 minutes and set a new password. 3. Reuse the same link. 4. Try an expired link.</w:t>
+              <w:lastRenderedPageBreak/>
+              <w:t xml:space="preserve">1. Request reset. 2. Use link </w:t>
+            </w:r>
+            <w:r>
+              <w:rPr>
+                <w:sz w:val="14"/>
+              </w:rPr>
+              <w:lastRenderedPageBreak/>
+              <w:t>within 15 minutes and set a new password. 3. Reuse the same link. 4. Try an expired link.</w:t>
             </w:r>
           </w:p>
         </w:tc>
@@ -1596,7 +1652,15 @@
               <w:rPr>
                 <w:sz w:val="14"/>
               </w:rPr>
-              <w:t>Reset link; new password; expired link</w:t>
+              <w:lastRenderedPageBreak/>
+              <w:t xml:space="preserve">Reset link; new </w:t>
+            </w:r>
+            <w:r>
+              <w:rPr>
+                <w:sz w:val="14"/>
+              </w:rPr>
+              <w:lastRenderedPageBreak/>
+              <w:t>password; expired link</w:t>
             </w:r>
           </w:p>
         </w:tc>
@@ -1609,7 +1673,15 @@
               <w:rPr>
                 <w:sz w:val="14"/>
               </w:rPr>
-              <w:t>Valid link works once; reused or expired link is rejected.</w:t>
+              <w:lastRenderedPageBreak/>
+              <w:t xml:space="preserve">Valid link works once; reused or </w:t>
+            </w:r>
+            <w:r>
+              <w:rPr>
+                <w:sz w:val="14"/>
+              </w:rPr>
+              <w:lastRenderedPageBreak/>
+              <w:t>expired link is rejected.</w:t>
             </w:r>
           </w:p>
         </w:tc>
@@ -1617,13 +1689,27 @@
           <w:tcPr>
             <w:tcW w:w="1440" w:type="dxa"/>
           </w:tcPr>
-          <w:p/>
+          <w:p>
+            <w:r>
+              <w:lastRenderedPageBreak/>
+              <w:t xml:space="preserve">Reset </w:t>
+            </w:r>
+            <w:r>
+              <w:lastRenderedPageBreak/>
+              <w:t>succeeded; reusing the same reset link returned “Invalid or expired password-reset link.” The 15-minute time expiry wasn't tested by waiting.</w:t>
+            </w:r>
+          </w:p>
         </w:tc>
         <w:tc>
           <w:tcPr>
             <w:tcW w:w="1080" w:type="dxa"/>
           </w:tcPr>
-          <w:p/>
+          <w:p>
+            <w:r>
+              <w:lastRenderedPageBreak/>
+              <w:t>Partial</w:t>
+            </w:r>
+          </w:p>
         </w:tc>
       </w:tr>
       <w:tr>
@@ -1725,13 +1811,24 @@
           <w:tcPr>
             <w:tcW w:w="1440" w:type="dxa"/>
           </w:tcPr>
-          <w:p/>
+          <w:p>
+            <w:pPr>
+              <w:jc w:val="center"/>
+            </w:pPr>
+            <w:r>
+              <w:t>Code revokes existing sessions after reset, but reuse of a pre-reset token wasn't independently tested.</w:t>
+            </w:r>
+          </w:p>
         </w:tc>
         <w:tc>
           <w:tcPr>
             <w:tcW w:w="1080" w:type="dxa"/>
           </w:tcPr>
-          <w:p/>
+          <w:p>
+            <w:r>
+              <w:t>Not Run</w:t>
+            </w:r>
+          </w:p>
         </w:tc>
       </w:tr>
       <w:tr>
@@ -1833,13 +1930,24 @@
           <w:tcPr>
             <w:tcW w:w="1440" w:type="dxa"/>
           </w:tcPr>
-          <w:p/>
+          <w:p>
+            <w:pPr>
+              <w:jc w:val="center"/>
+            </w:pPr>
+            <w:r>
+              <w:t>Sign-out succeeded in the UI; rejection of the previous token in a protected API request wasn't directly tested.</w:t>
+            </w:r>
+          </w:p>
         </w:tc>
         <w:tc>
           <w:tcPr>
             <w:tcW w:w="1080" w:type="dxa"/>
           </w:tcPr>
-          <w:p/>
+          <w:p>
+            <w:r>
+              <w:t>Not Run</w:t>
+            </w:r>
+          </w:p>
         </w:tc>
       </w:tr>
       <w:tr>
@@ -1941,13 +2049,21 @@
           <w:tcPr>
             <w:tcW w:w="1440" w:type="dxa"/>
           </w:tcPr>
-          <w:p/>
+          <w:p>
+            <w:r>
+              <w:t>Not tested. PIN/biometric app lock and automatic re-lock after two minutes in the background were not verified.</w:t>
+            </w:r>
+          </w:p>
         </w:tc>
         <w:tc>
           <w:tcPr>
             <w:tcW w:w="1080" w:type="dxa"/>
           </w:tcPr>
-          <w:p/>
+          <w:p>
+            <w:r>
+              <w:t>Not Run</w:t>
+            </w:r>
+          </w:p>
         </w:tc>
       </w:tr>
       <w:tr>
@@ -1989,14 +2105,7 @@
               <w:rPr>
                 <w:sz w:val="14"/>
               </w:rPr>
-              <w:t xml:space="preserve">Verify Terms and Privacy consent is mandatory at </w:t>
-            </w:r>
-            <w:r>
-              <w:rPr>
-                <w:sz w:val="14"/>
-              </w:rPr>
-              <w:lastRenderedPageBreak/>
-              <w:t>registration (REQ-12)</w:t>
+              <w:t>Verify Terms and Privacy consent is mandatory at registration (REQ-12)</w:t>
             </w:r>
           </w:p>
         </w:tc>
@@ -2009,7 +2118,6 @@
               <w:rPr>
                 <w:sz w:val="14"/>
               </w:rPr>
-              <w:lastRenderedPageBreak/>
               <w:t>Registration form is open</w:t>
             </w:r>
           </w:p>
@@ -2023,14 +2131,7 @@
               <w:rPr>
                 <w:sz w:val="14"/>
               </w:rPr>
-              <w:t xml:space="preserve">1. Leave Terms/Privacy consent unchecked. 2. </w:t>
-            </w:r>
-            <w:r>
-              <w:rPr>
-                <w:sz w:val="14"/>
-              </w:rPr>
-              <w:lastRenderedPageBreak/>
-              <w:t>Submit. 3. Repeat with consent checked.</w:t>
+              <w:t>1. Leave Terms/Privacy consent unchecked. 2. Submit. 3. Repeat with consent checked.</w:t>
             </w:r>
           </w:p>
         </w:tc>
@@ -2043,7 +2144,6 @@
               <w:rPr>
                 <w:sz w:val="14"/>
               </w:rPr>
-              <w:lastRenderedPageBreak/>
               <w:t>Consent: No, then Yes</w:t>
             </w:r>
           </w:p>
@@ -2057,14 +2157,7 @@
               <w:rPr>
                 <w:sz w:val="14"/>
               </w:rPr>
-              <w:t xml:space="preserve">No account is created without explicit consent; with consent, </w:t>
-            </w:r>
-            <w:r>
-              <w:rPr>
-                <w:sz w:val="14"/>
-              </w:rPr>
-              <w:lastRenderedPageBreak/>
-              <w:t>registration proceeds and consent is recorded.</w:t>
+              <w:t>No account is created without explicit consent; with consent, registration proceeds and consent is recorded.</w:t>
             </w:r>
           </w:p>
         </w:tc>
@@ -2074,12 +2167,7 @@
           </w:tcPr>
           <w:p>
             <w:r>
-              <w:lastRenderedPageBreak/>
-              <w:t xml:space="preserve">Submission </w:t>
-            </w:r>
-            <w:r>
-              <w:lastRenderedPageBreak/>
-              <w:t>was blocked by browser validation when the Terms of Service checkbox was unchecked. No registration request was submitted.</w:t>
+              <w:t>Submission was blocked by browser validation when the Terms of Service checkbox was unchecked. No registration request was submitted.</w:t>
             </w:r>
           </w:p>
         </w:tc>
@@ -2089,7 +2177,6 @@
           </w:tcPr>
           <w:p>
             <w:r>
-              <w:lastRenderedPageBreak/>
               <w:t>Passed</w:t>
             </w:r>
           </w:p>
@@ -2121,7 +2208,14 @@
               <w:rPr>
                 <w:sz w:val="14"/>
               </w:rPr>
-              <w:t>User Registration &amp; Authentication</w:t>
+              <w:t xml:space="preserve">User Registration &amp; </w:t>
+            </w:r>
+            <w:r>
+              <w:rPr>
+                <w:sz w:val="14"/>
+              </w:rPr>
+              <w:lastRenderedPageBreak/>
+              <w:t>Authentication</w:t>
             </w:r>
           </w:p>
         </w:tc>
@@ -2134,7 +2228,15 @@
               <w:rPr>
                 <w:sz w:val="14"/>
               </w:rPr>
-              <w:t>Verify authentication unit logic accepts valid credentials for an active verified user (REQ-7)</w:t>
+              <w:lastRenderedPageBreak/>
+              <w:t xml:space="preserve">Verify authentication unit </w:t>
+            </w:r>
+            <w:r>
+              <w:rPr>
+                <w:sz w:val="14"/>
+              </w:rPr>
+              <w:lastRenderedPageBreak/>
+              <w:t>logic accepts valid credentials for an active verified user (REQ-7)</w:t>
             </w:r>
           </w:p>
         </w:tc>
@@ -2147,7 +2249,15 @@
               <w:rPr>
                 <w:sz w:val="14"/>
               </w:rPr>
-              <w:t>Verified active account exists</w:t>
+              <w:lastRenderedPageBreak/>
+              <w:t xml:space="preserve">Verified active account </w:t>
+            </w:r>
+            <w:r>
+              <w:rPr>
+                <w:sz w:val="14"/>
+              </w:rPr>
+              <w:lastRenderedPageBreak/>
+              <w:t>exists</w:t>
             </w:r>
           </w:p>
         </w:tc>
@@ -2160,7 +2270,15 @@
               <w:rPr>
                 <w:sz w:val="14"/>
               </w:rPr>
-              <w:t>1. Submit valid email and password. 2. Validate authentication result.</w:t>
+              <w:lastRenderedPageBreak/>
+              <w:t xml:space="preserve">1. Submit valid email and </w:t>
+            </w:r>
+            <w:r>
+              <w:rPr>
+                <w:sz w:val="14"/>
+              </w:rPr>
+              <w:lastRenderedPageBreak/>
+              <w:t>password. 2. Validate authentication result.</w:t>
             </w:r>
           </w:p>
         </w:tc>
@@ -2173,7 +2291,15 @@
               <w:rPr>
                 <w:sz w:val="14"/>
               </w:rPr>
-              <w:t>Email: user1@test.com; Password: Test@1234</w:t>
+              <w:lastRenderedPageBreak/>
+              <w:t xml:space="preserve">Email: </w:t>
+            </w:r>
+            <w:r>
+              <w:rPr>
+                <w:sz w:val="14"/>
+              </w:rPr>
+              <w:lastRenderedPageBreak/>
+              <w:t>user1@test.com; Password: Test@1234</w:t>
             </w:r>
           </w:p>
         </w:tc>
@@ -2186,7 +2312,15 @@
               <w:rPr>
                 <w:sz w:val="14"/>
               </w:rPr>
-              <w:t>Authentication succeeds for valid credentials.</w:t>
+              <w:lastRenderedPageBreak/>
+              <w:t xml:space="preserve">Authentication succeeds for valid </w:t>
+            </w:r>
+            <w:r>
+              <w:rPr>
+                <w:sz w:val="14"/>
+              </w:rPr>
+              <w:lastRenderedPageBreak/>
+              <w:t>credentials.</w:t>
             </w:r>
           </w:p>
         </w:tc>
@@ -2194,13 +2328,27 @@
           <w:tcPr>
             <w:tcW w:w="1440" w:type="dxa"/>
           </w:tcPr>
-          <w:p/>
+          <w:p>
+            <w:r>
+              <w:lastRenderedPageBreak/>
+              <w:t xml:space="preserve">Sign-in </w:t>
+            </w:r>
+            <w:r>
+              <w:lastRenderedPageBreak/>
+              <w:t>succeeded with verified account credentials</w:t>
+            </w:r>
+          </w:p>
         </w:tc>
         <w:tc>
           <w:tcPr>
             <w:tcW w:w="1080" w:type="dxa"/>
           </w:tcPr>
-          <w:p/>
+          <w:p>
+            <w:r>
+              <w:lastRenderedPageBreak/>
+              <w:t>Pass</w:t>
+            </w:r>
+          </w:p>
         </w:tc>
       </w:tr>
     </w:tbl>

</xml_diff>

<commit_message>
US-10: Browse, filter and search transactions
</commit_message>
<xml_diff>
--- a/Test-Plan-Personal-Finance-Expense-Manager.docx
+++ b/Test-Plan-Personal-Finance-Expense-Manager.docx
@@ -5136,13 +5136,21 @@
           <w:tcPr>
             <w:tcW w:w="1440" w:type="dxa"/>
           </w:tcPr>
-          <w:p/>
+          <w:p>
+            <w:r>
+              <w:t>Manually verified the transaction row displays date, category, account, note and amount; page 1 of 1 displayed. Multiple-page pagination and ordering with multiple transactions still need verification.</w:t>
+            </w:r>
+          </w:p>
         </w:tc>
         <w:tc>
           <w:tcPr>
             <w:tcW w:w="1080" w:type="dxa"/>
           </w:tcPr>
-          <w:p/>
+          <w:p>
+            <w:r>
+              <w:t>PARTIAL</w:t>
+            </w:r>
+          </w:p>
         </w:tc>
       </w:tr>
       <w:tr>
@@ -5244,13 +5252,21 @@
           <w:tcPr>
             <w:tcW w:w="1440" w:type="dxa"/>
           </w:tcPr>
-          <w:p/>
+          <w:p>
+            <w:r>
+              <w:t>Manual checks: note search grocery returned 1 match and total INR 250.00; tag food returned 1 match and total INR 250.00; minimum amount 300 returned 0 matches and INR 0.00; combining food tag with Income returned 0 matches and INR 0.00. Date, account, category and maximum-amount filters still need individual verification.</w:t>
+            </w:r>
+          </w:p>
         </w:tc>
         <w:tc>
           <w:tcPr>
             <w:tcW w:w="1080" w:type="dxa"/>
           </w:tcPr>
-          <w:p/>
+          <w:p>
+            <w:r>
+              <w:t>PARTIAL</w:t>
+            </w:r>
+          </w:p>
         </w:tc>
       </w:tr>
       <w:tr>

</xml_diff>